<commit_message>
Make the Word TOC clickable with live page numbers
The TOC previously carried the print design's hardcoded page numbers,
which don't match the Word document's own pagination. Each chapter hero
title now carries a bookmark, and every TOC entry is an internal
hyperlink whose page number is a PAGEREF field — so entries click
through to their chapter and always show the real page, with
updateFields set so Word refreshes them on open.

Co-Authored-By: Claude Fable 5 <noreply@anthropic.com>
Claude-Session: https://claude.ai/code/session_01TqA3aMv9kR3zVicHwajJDu
</commit_message>
<xml_diff>
--- a/ebook/screens-down-family-up-ebook-v3.docx
+++ b/ebook/screens-down-family-up-ebook-v3.docx
@@ -356,6 +356,7 @@
             <w:pPr>
               <w:spacing w:after="120"/>
             </w:pPr>
+            <w:bookmarkStart w:name="toc_read_this_first" w:id="1"/>
             <w:r>
               <w:rPr>
                 <w:rFonts w:ascii="Oswald" w:cs="Oswald" w:eastAsia="Oswald" w:hAnsi="Oswald"/>
@@ -368,6 +369,7 @@
               </w:rPr>
               <w:t xml:space="preserve">You Are Not Failing</w:t>
             </w:r>
+            <w:bookmarkEnd w:id="1"/>
           </w:p>
           <w:p>
             <w:pPr>
@@ -589,6 +591,7 @@
             <w:pPr>
               <w:spacing w:after="120"/>
             </w:pPr>
+            <w:bookmarkStart w:name="toc_the_data" w:id="1"/>
             <w:r>
               <w:rPr>
                 <w:rFonts w:ascii="Oswald" w:cs="Oswald" w:eastAsia="Oswald" w:hAnsi="Oswald"/>
@@ -601,6 +604,7 @@
               </w:rPr>
               <w:t xml:space="preserve">The Research Is Clear</w:t>
             </w:r>
+            <w:bookmarkEnd w:id="1"/>
           </w:p>
           <w:p>
             <w:pPr>
@@ -1562,6 +1566,7 @@
             <w:pPr>
               <w:spacing w:after="120"/>
             </w:pPr>
+            <w:bookmarkStart w:name="toc_what_s_inside" w:id="1"/>
             <w:r>
               <w:rPr>
                 <w:rFonts w:ascii="Oswald" w:cs="Oswald" w:eastAsia="Oswald" w:hAnsi="Oswald"/>
@@ -1574,6 +1579,7 @@
               </w:rPr>
               <w:t xml:space="preserve">Table of Contents</w:t>
             </w:r>
+            <w:bookmarkEnd w:id="1"/>
           </w:p>
         </w:tc>
       </w:tr>
@@ -1615,22 +1621,26 @@
         <w:t xml:space="preserve">—</w:t>
       </w:r>
       <w:r>
-        <w:rPr>
-          <w:rFonts w:ascii="Source Sans 3" w:cs="Source Sans 3" w:eastAsia="Source Sans 3" w:hAnsi="Source Sans 3"/>
-          <w:color w:val="2C3448"/>
-          <w:sz w:val="18"/>
-          <w:szCs w:val="18"/>
-        </w:rPr>
-        <w:t xml:space="preserve">	Introduction</w:t>
-      </w:r>
-      <w:r>
-        <w:rPr>
-          <w:rFonts w:ascii="Source Sans 3" w:cs="Source Sans 3" w:eastAsia="Source Sans 3" w:hAnsi="Source Sans 3"/>
-          <w:color w:val="8A8570"/>
-          <w:sz w:val="16"/>
-          <w:szCs w:val="16"/>
-        </w:rPr>
-        <w:t xml:space="preserve">	4</w:t>
+        <w:t xml:space="preserve">	</w:t>
+      </w:r>
+      <w:hyperlink w:history="1" w:anchor="toc_introduction">
+        <w:r>
+          <w:rPr>
+            <w:rFonts w:ascii="Source Sans 3" w:cs="Source Sans 3" w:eastAsia="Source Sans 3" w:hAnsi="Source Sans 3"/>
+            <w:color w:val="2C3448"/>
+            <w:sz w:val="18"/>
+            <w:szCs w:val="18"/>
+          </w:rPr>
+          <w:t xml:space="preserve">Introduction</w:t>
+        </w:r>
+      </w:hyperlink>
+      <w:r>
+        <w:t xml:space="preserve">	</w:t>
+      </w:r>
+      <w:r>
+        <w:fldChar w:fldCharType="begin" w:dirty="true"/>
+        <w:instrText xml:space="preserve">PAGEREF toc_introduction \h</w:instrText>
+        <w:fldChar w:fldCharType="end"/>
       </w:r>
     </w:p>
     <w:p>
@@ -1658,22 +1668,26 @@
         <w:t xml:space="preserve">Ch. 1</w:t>
       </w:r>
       <w:r>
-        <w:rPr>
-          <w:rFonts w:ascii="Source Sans 3" w:cs="Source Sans 3" w:eastAsia="Source Sans 3" w:hAnsi="Source Sans 3"/>
-          <w:color w:val="2C3448"/>
-          <w:sz w:val="18"/>
-          <w:szCs w:val="18"/>
-        </w:rPr>
-        <w:t xml:space="preserve">	Understanding Screen Time's Impact</w:t>
-      </w:r>
-      <w:r>
-        <w:rPr>
-          <w:rFonts w:ascii="Source Sans 3" w:cs="Source Sans 3" w:eastAsia="Source Sans 3" w:hAnsi="Source Sans 3"/>
-          <w:color w:val="8A8570"/>
-          <w:sz w:val="16"/>
-          <w:szCs w:val="16"/>
-        </w:rPr>
-        <w:t xml:space="preserve">	5</w:t>
+        <w:t xml:space="preserve">	</w:t>
+      </w:r>
+      <w:hyperlink w:history="1" w:anchor="toc_chapter_one">
+        <w:r>
+          <w:rPr>
+            <w:rFonts w:ascii="Source Sans 3" w:cs="Source Sans 3" w:eastAsia="Source Sans 3" w:hAnsi="Source Sans 3"/>
+            <w:color w:val="2C3448"/>
+            <w:sz w:val="18"/>
+            <w:szCs w:val="18"/>
+          </w:rPr>
+          <w:t xml:space="preserve">Understanding Screen Time's Impact</w:t>
+        </w:r>
+      </w:hyperlink>
+      <w:r>
+        <w:t xml:space="preserve">	</w:t>
+      </w:r>
+      <w:r>
+        <w:fldChar w:fldCharType="begin" w:dirty="true"/>
+        <w:instrText xml:space="preserve">PAGEREF toc_chapter_one \h</w:instrText>
+        <w:fldChar w:fldCharType="end"/>
       </w:r>
     </w:p>
     <w:p>
@@ -1701,22 +1715,26 @@
         <w:t xml:space="preserve">Ch. 2</w:t>
       </w:r>
       <w:r>
-        <w:rPr>
-          <w:rFonts w:ascii="Source Sans 3" w:cs="Source Sans 3" w:eastAsia="Source Sans 3" w:hAnsi="Source Sans 3"/>
-          <w:color w:val="2C3448"/>
-          <w:sz w:val="18"/>
-          <w:szCs w:val="18"/>
-        </w:rPr>
-        <w:t xml:space="preserve">	Preparing Your Family for the Reset</w:t>
-      </w:r>
-      <w:r>
-        <w:rPr>
-          <w:rFonts w:ascii="Source Sans 3" w:cs="Source Sans 3" w:eastAsia="Source Sans 3" w:hAnsi="Source Sans 3"/>
-          <w:color w:val="8A8570"/>
-          <w:sz w:val="16"/>
-          <w:szCs w:val="16"/>
-        </w:rPr>
-        <w:t xml:space="preserve">	9</w:t>
+        <w:t xml:space="preserve">	</w:t>
+      </w:r>
+      <w:hyperlink w:history="1" w:anchor="toc_chapter_two">
+        <w:r>
+          <w:rPr>
+            <w:rFonts w:ascii="Source Sans 3" w:cs="Source Sans 3" w:eastAsia="Source Sans 3" w:hAnsi="Source Sans 3"/>
+            <w:color w:val="2C3448"/>
+            <w:sz w:val="18"/>
+            <w:szCs w:val="18"/>
+          </w:rPr>
+          <w:t xml:space="preserve">Preparing Your Family for the Reset</w:t>
+        </w:r>
+      </w:hyperlink>
+      <w:r>
+        <w:t xml:space="preserve">	</w:t>
+      </w:r>
+      <w:r>
+        <w:fldChar w:fldCharType="begin" w:dirty="true"/>
+        <w:instrText xml:space="preserve">PAGEREF toc_chapter_two \h</w:instrText>
+        <w:fldChar w:fldCharType="end"/>
       </w:r>
     </w:p>
     <w:p>
@@ -1744,22 +1762,26 @@
         <w:t xml:space="preserve">Ch. 3</w:t>
       </w:r>
       <w:r>
-        <w:rPr>
-          <w:rFonts w:ascii="Source Sans 3" w:cs="Source Sans 3" w:eastAsia="Source Sans 3" w:hAnsi="Source Sans 3"/>
-          <w:color w:val="2C3448"/>
-          <w:sz w:val="18"/>
-          <w:szCs w:val="18"/>
-        </w:rPr>
-        <w:t xml:space="preserve">	Days 1–2 — Establishing Boundaries</w:t>
-      </w:r>
-      <w:r>
-        <w:rPr>
-          <w:rFonts w:ascii="Source Sans 3" w:cs="Source Sans 3" w:eastAsia="Source Sans 3" w:hAnsi="Source Sans 3"/>
-          <w:color w:val="8A8570"/>
-          <w:sz w:val="16"/>
-          <w:szCs w:val="16"/>
-        </w:rPr>
-        <w:t xml:space="preserve">	17</w:t>
+        <w:t xml:space="preserve">	</w:t>
+      </w:r>
+      <w:hyperlink w:history="1" w:anchor="toc_chapter_three">
+        <w:r>
+          <w:rPr>
+            <w:rFonts w:ascii="Source Sans 3" w:cs="Source Sans 3" w:eastAsia="Source Sans 3" w:hAnsi="Source Sans 3"/>
+            <w:color w:val="2C3448"/>
+            <w:sz w:val="18"/>
+            <w:szCs w:val="18"/>
+          </w:rPr>
+          <w:t xml:space="preserve">Days 1–2 — Establishing Boundaries</w:t>
+        </w:r>
+      </w:hyperlink>
+      <w:r>
+        <w:t xml:space="preserve">	</w:t>
+      </w:r>
+      <w:r>
+        <w:fldChar w:fldCharType="begin" w:dirty="true"/>
+        <w:instrText xml:space="preserve">PAGEREF toc_chapter_three \h</w:instrText>
+        <w:fldChar w:fldCharType="end"/>
       </w:r>
     </w:p>
     <w:p>
@@ -1787,22 +1809,26 @@
         <w:t xml:space="preserve">Ch. 4</w:t>
       </w:r>
       <w:r>
-        <w:rPr>
-          <w:rFonts w:ascii="Source Sans 3" w:cs="Source Sans 3" w:eastAsia="Source Sans 3" w:hAnsi="Source Sans 3"/>
-          <w:color w:val="2C3448"/>
-          <w:sz w:val="18"/>
-          <w:szCs w:val="18"/>
-        </w:rPr>
-        <w:t xml:space="preserve">	Days 3–4 — Engaging Activities</w:t>
-      </w:r>
-      <w:r>
-        <w:rPr>
-          <w:rFonts w:ascii="Source Sans 3" w:cs="Source Sans 3" w:eastAsia="Source Sans 3" w:hAnsi="Source Sans 3"/>
-          <w:color w:val="8A8570"/>
-          <w:sz w:val="16"/>
-          <w:szCs w:val="16"/>
-        </w:rPr>
-        <w:t xml:space="preserve">	31</w:t>
+        <w:t xml:space="preserve">	</w:t>
+      </w:r>
+      <w:hyperlink w:history="1" w:anchor="toc_chapter_four">
+        <w:r>
+          <w:rPr>
+            <w:rFonts w:ascii="Source Sans 3" w:cs="Source Sans 3" w:eastAsia="Source Sans 3" w:hAnsi="Source Sans 3"/>
+            <w:color w:val="2C3448"/>
+            <w:sz w:val="18"/>
+            <w:szCs w:val="18"/>
+          </w:rPr>
+          <w:t xml:space="preserve">Days 3–4 — Engaging Activities</w:t>
+        </w:r>
+      </w:hyperlink>
+      <w:r>
+        <w:t xml:space="preserve">	</w:t>
+      </w:r>
+      <w:r>
+        <w:fldChar w:fldCharType="begin" w:dirty="true"/>
+        <w:instrText xml:space="preserve">PAGEREF toc_chapter_four \h</w:instrText>
+        <w:fldChar w:fldCharType="end"/>
       </w:r>
     </w:p>
     <w:p>
@@ -1830,22 +1856,26 @@
         <w:t xml:space="preserve">Ch. 5</w:t>
       </w:r>
       <w:r>
-        <w:rPr>
-          <w:rFonts w:ascii="Source Sans 3" w:cs="Source Sans 3" w:eastAsia="Source Sans 3" w:hAnsi="Source Sans 3"/>
-          <w:color w:val="2C3448"/>
-          <w:sz w:val="18"/>
-          <w:szCs w:val="18"/>
-        </w:rPr>
-        <w:t xml:space="preserve">	Days 5–6 — Deepening Connections</w:t>
-      </w:r>
-      <w:r>
-        <w:rPr>
-          <w:rFonts w:ascii="Source Sans 3" w:cs="Source Sans 3" w:eastAsia="Source Sans 3" w:hAnsi="Source Sans 3"/>
-          <w:color w:val="8A8570"/>
-          <w:sz w:val="16"/>
-          <w:szCs w:val="16"/>
-        </w:rPr>
-        <w:t xml:space="preserve">	45</w:t>
+        <w:t xml:space="preserve">	</w:t>
+      </w:r>
+      <w:hyperlink w:history="1" w:anchor="toc_chapter_five">
+        <w:r>
+          <w:rPr>
+            <w:rFonts w:ascii="Source Sans 3" w:cs="Source Sans 3" w:eastAsia="Source Sans 3" w:hAnsi="Source Sans 3"/>
+            <w:color w:val="2C3448"/>
+            <w:sz w:val="18"/>
+            <w:szCs w:val="18"/>
+          </w:rPr>
+          <w:t xml:space="preserve">Days 5–6 — Deepening Connections</w:t>
+        </w:r>
+      </w:hyperlink>
+      <w:r>
+        <w:t xml:space="preserve">	</w:t>
+      </w:r>
+      <w:r>
+        <w:fldChar w:fldCharType="begin" w:dirty="true"/>
+        <w:instrText xml:space="preserve">PAGEREF toc_chapter_five \h</w:instrText>
+        <w:fldChar w:fldCharType="end"/>
       </w:r>
     </w:p>
     <w:p>
@@ -1873,22 +1903,26 @@
         <w:t xml:space="preserve">Ch. 6</w:t>
       </w:r>
       <w:r>
-        <w:rPr>
-          <w:rFonts w:ascii="Source Sans 3" w:cs="Source Sans 3" w:eastAsia="Source Sans 3" w:hAnsi="Source Sans 3"/>
-          <w:color w:val="2C3448"/>
-          <w:sz w:val="18"/>
-          <w:szCs w:val="18"/>
-        </w:rPr>
-        <w:t xml:space="preserve">	Day 7 — Reflection and Planning</w:t>
-      </w:r>
-      <w:r>
-        <w:rPr>
-          <w:rFonts w:ascii="Source Sans 3" w:cs="Source Sans 3" w:eastAsia="Source Sans 3" w:hAnsi="Source Sans 3"/>
-          <w:color w:val="8A8570"/>
-          <w:sz w:val="16"/>
-          <w:szCs w:val="16"/>
-        </w:rPr>
-        <w:t xml:space="preserve">	67</w:t>
+        <w:t xml:space="preserve">	</w:t>
+      </w:r>
+      <w:hyperlink w:history="1" w:anchor="toc_chapter_six">
+        <w:r>
+          <w:rPr>
+            <w:rFonts w:ascii="Source Sans 3" w:cs="Source Sans 3" w:eastAsia="Source Sans 3" w:hAnsi="Source Sans 3"/>
+            <w:color w:val="2C3448"/>
+            <w:sz w:val="18"/>
+            <w:szCs w:val="18"/>
+          </w:rPr>
+          <w:t xml:space="preserve">Day 7 — Reflection and Planning</w:t>
+        </w:r>
+      </w:hyperlink>
+      <w:r>
+        <w:t xml:space="preserve">	</w:t>
+      </w:r>
+      <w:r>
+        <w:fldChar w:fldCharType="begin" w:dirty="true"/>
+        <w:instrText xml:space="preserve">PAGEREF toc_chapter_six \h</w:instrText>
+        <w:fldChar w:fldCharType="end"/>
       </w:r>
     </w:p>
     <w:p>
@@ -1916,22 +1950,26 @@
         <w:t xml:space="preserve">Ch. 7</w:t>
       </w:r>
       <w:r>
-        <w:rPr>
-          <w:rFonts w:ascii="Source Sans 3" w:cs="Source Sans 3" w:eastAsia="Source Sans 3" w:hAnsi="Source Sans 3"/>
-          <w:color w:val="2C3448"/>
-          <w:sz w:val="18"/>
-          <w:szCs w:val="18"/>
-        </w:rPr>
-        <w:t xml:space="preserve">	Long-Term Success Strategies</w:t>
-      </w:r>
-      <w:r>
-        <w:rPr>
-          <w:rFonts w:ascii="Source Sans 3" w:cs="Source Sans 3" w:eastAsia="Source Sans 3" w:hAnsi="Source Sans 3"/>
-          <w:color w:val="8A8570"/>
-          <w:sz w:val="16"/>
-          <w:szCs w:val="16"/>
-        </w:rPr>
-        <w:t xml:space="preserve">	88</w:t>
+        <w:t xml:space="preserve">	</w:t>
+      </w:r>
+      <w:hyperlink w:history="1" w:anchor="toc_chapter_seven">
+        <w:r>
+          <w:rPr>
+            <w:rFonts w:ascii="Source Sans 3" w:cs="Source Sans 3" w:eastAsia="Source Sans 3" w:hAnsi="Source Sans 3"/>
+            <w:color w:val="2C3448"/>
+            <w:sz w:val="18"/>
+            <w:szCs w:val="18"/>
+          </w:rPr>
+          <w:t xml:space="preserve">Long-Term Success Strategies</w:t>
+        </w:r>
+      </w:hyperlink>
+      <w:r>
+        <w:t xml:space="preserve">	</w:t>
+      </w:r>
+      <w:r>
+        <w:fldChar w:fldCharType="begin" w:dirty="true"/>
+        <w:instrText xml:space="preserve">PAGEREF toc_chapter_seven \h</w:instrText>
+        <w:fldChar w:fldCharType="end"/>
       </w:r>
     </w:p>
     <w:p>
@@ -2002,6 +2040,7 @@
             <w:pPr>
               <w:spacing w:after="120"/>
             </w:pPr>
+            <w:bookmarkStart w:name="toc_introduction" w:id="1"/>
             <w:r>
               <w:rPr>
                 <w:rFonts w:ascii="Oswald" w:cs="Oswald" w:eastAsia="Oswald" w:hAnsi="Oswald"/>
@@ -2014,6 +2053,7 @@
               </w:rPr>
               <w:t xml:space="preserve">The Moment at the Grand Canyon</w:t>
             </w:r>
+            <w:bookmarkEnd w:id="1"/>
           </w:p>
           <w:p>
             <w:pPr>
@@ -2764,6 +2804,7 @@
             <w:pPr>
               <w:spacing w:after="120"/>
             </w:pPr>
+            <w:bookmarkStart w:name="toc_a_preview_of_the_tools_inside" w:id="1"/>
             <w:r>
               <w:rPr>
                 <w:rFonts w:ascii="Oswald" w:cs="Oswald" w:eastAsia="Oswald" w:hAnsi="Oswald"/>
@@ -2776,6 +2817,7 @@
               </w:rPr>
               <w:t xml:space="preserve">A Sample Script</w:t>
             </w:r>
+            <w:bookmarkEnd w:id="1"/>
           </w:p>
           <w:p>
             <w:pPr>
@@ -3105,6 +3147,7 @@
             <w:pPr>
               <w:spacing w:after="120"/>
             </w:pPr>
+            <w:bookmarkStart w:name="toc_chapter_one" w:id="1"/>
             <w:r>
               <w:rPr>
                 <w:rFonts w:ascii="Oswald" w:cs="Oswald" w:eastAsia="Oswald" w:hAnsi="Oswald"/>
@@ -3117,6 +3160,7 @@
               </w:rPr>
               <w:t xml:space="preserve">Understanding Screen Time's Impact</w:t>
             </w:r>
+            <w:bookmarkEnd w:id="1"/>
           </w:p>
           <w:p>
             <w:pPr>
@@ -3974,6 +4018,7 @@
             <w:pPr>
               <w:spacing w:after="120"/>
             </w:pPr>
+            <w:bookmarkStart w:name="toc_chapter_two" w:id="1"/>
             <w:r>
               <w:rPr>
                 <w:rFonts w:ascii="Oswald" w:cs="Oswald" w:eastAsia="Oswald" w:hAnsi="Oswald"/>
@@ -3986,6 +4031,7 @@
               </w:rPr>
               <w:t xml:space="preserve">Preparing Your Family for the Reset</w:t>
             </w:r>
+            <w:bookmarkEnd w:id="1"/>
           </w:p>
           <w:p>
             <w:pPr>
@@ -6358,6 +6404,7 @@
             <w:pPr>
               <w:spacing w:after="120"/>
             </w:pPr>
+            <w:bookmarkStart w:name="toc_chapter_three" w:id="1"/>
             <w:r>
               <w:rPr>
                 <w:rFonts w:ascii="Oswald" w:cs="Oswald" w:eastAsia="Oswald" w:hAnsi="Oswald"/>
@@ -6370,6 +6417,7 @@
               </w:rPr>
               <w:t xml:space="preserve">Days 1–2: Establishing Boundaries</w:t>
             </w:r>
+            <w:bookmarkEnd w:id="1"/>
           </w:p>
           <w:p>
             <w:pPr>
@@ -8029,6 +8077,7 @@
             <w:pPr>
               <w:spacing w:after="120"/>
             </w:pPr>
+            <w:bookmarkStart w:name="toc_chapter_four" w:id="1"/>
             <w:r>
               <w:rPr>
                 <w:rFonts w:ascii="Oswald" w:cs="Oswald" w:eastAsia="Oswald" w:hAnsi="Oswald"/>
@@ -8041,6 +8090,7 @@
               </w:rPr>
               <w:t xml:space="preserve">Days 3–4: Engaging Activities</w:t>
             </w:r>
+            <w:bookmarkEnd w:id="1"/>
           </w:p>
           <w:p>
             <w:pPr>
@@ -9437,6 +9487,7 @@
             <w:pPr>
               <w:spacing w:after="120"/>
             </w:pPr>
+            <w:bookmarkStart w:name="toc_chapter_five" w:id="1"/>
             <w:r>
               <w:rPr>
                 <w:rFonts w:ascii="Oswald" w:cs="Oswald" w:eastAsia="Oswald" w:hAnsi="Oswald"/>
@@ -9449,6 +9500,7 @@
               </w:rPr>
               <w:t xml:space="preserve">Days 5–6: Deepening Connections</w:t>
             </w:r>
+            <w:bookmarkEnd w:id="1"/>
           </w:p>
           <w:p>
             <w:pPr>
@@ -10874,6 +10926,7 @@
             <w:pPr>
               <w:spacing w:after="120"/>
             </w:pPr>
+            <w:bookmarkStart w:name="toc_chapter_six" w:id="1"/>
             <w:r>
               <w:rPr>
                 <w:rFonts w:ascii="Oswald" w:cs="Oswald" w:eastAsia="Oswald" w:hAnsi="Oswald"/>
@@ -10886,6 +10939,7 @@
               </w:rPr>
               <w:t xml:space="preserve">Day 7: Reflection and Planning</w:t>
             </w:r>
+            <w:bookmarkEnd w:id="1"/>
           </w:p>
           <w:p>
             <w:pPr>
@@ -14249,6 +14303,7 @@
             <w:pPr>
               <w:spacing w:after="120"/>
             </w:pPr>
+            <w:bookmarkStart w:name="toc_chapter_seven" w:id="1"/>
             <w:r>
               <w:rPr>
                 <w:rFonts w:ascii="Oswald" w:cs="Oswald" w:eastAsia="Oswald" w:hAnsi="Oswald"/>
@@ -14261,6 +14316,7 @@
               </w:rPr>
               <w:t xml:space="preserve">Long-Term Success Strategies</w:t>
             </w:r>
+            <w:bookmarkEnd w:id="1"/>
           </w:p>
           <w:p>
             <w:pPr>

</xml_diff>